<commit_message>
Fixed opacity of bg-graphic
</commit_message>
<xml_diff>
--- a/HellBurn_Whitepaper_v3.0_DE.docx
+++ b/HellBurn_Whitepaper_v3.0_DE.docx
@@ -574,14 +574,14 @@
         </w:tblCellMar>
       </w:tblPr>
       <w:tblGrid>
-        <w:gridCol w:w="3498"/>
-        <w:gridCol w:w="5862"/>
+        <w:gridCol w:w="3497"/>
+        <w:gridCol w:w="5863"/>
       </w:tblGrid>
       <w:tr>
         <w:trPr/>
         <w:tc>
           <w:tcPr>
-            <w:tcW w:w="3498" w:type="dxa"/>
+            <w:tcW w:w="3497" w:type="dxa"/>
             <w:tcBorders>
               <w:top w:val="single" w:sz="2" w:space="0" w:color="CCCCCC"/>
               <w:start w:val="single" w:sz="2" w:space="0" w:color="CCCCCC"/>
@@ -610,7 +610,7 @@
         </w:tc>
         <w:tc>
           <w:tcPr>
-            <w:tcW w:w="5862" w:type="dxa"/>
+            <w:tcW w:w="5863" w:type="dxa"/>
             <w:tcBorders>
               <w:top w:val="single" w:sz="2" w:space="0" w:color="CCCCCC"/>
               <w:start w:val="single" w:sz="2" w:space="0" w:color="CCCCCC"/>
@@ -642,7 +642,7 @@
         <w:trPr/>
         <w:tc>
           <w:tcPr>
-            <w:tcW w:w="3498" w:type="dxa"/>
+            <w:tcW w:w="3497" w:type="dxa"/>
             <w:tcBorders>
               <w:top w:val="single" w:sz="2" w:space="0" w:color="CCCCCC"/>
               <w:start w:val="single" w:sz="2" w:space="0" w:color="CCCCCC"/>
@@ -671,7 +671,7 @@
         </w:tc>
         <w:tc>
           <w:tcPr>
-            <w:tcW w:w="5862" w:type="dxa"/>
+            <w:tcW w:w="5863" w:type="dxa"/>
             <w:tcBorders>
               <w:top w:val="single" w:sz="2" w:space="0" w:color="CCCCCC"/>
               <w:start w:val="single" w:sz="2" w:space="0" w:color="CCCCCC"/>
@@ -703,7 +703,7 @@
         <w:trPr/>
         <w:tc>
           <w:tcPr>
-            <w:tcW w:w="3498" w:type="dxa"/>
+            <w:tcW w:w="3497" w:type="dxa"/>
             <w:tcBorders>
               <w:top w:val="single" w:sz="2" w:space="0" w:color="CCCCCC"/>
               <w:start w:val="single" w:sz="2" w:space="0" w:color="CCCCCC"/>
@@ -732,7 +732,7 @@
         </w:tc>
         <w:tc>
           <w:tcPr>
-            <w:tcW w:w="5862" w:type="dxa"/>
+            <w:tcW w:w="5863" w:type="dxa"/>
             <w:tcBorders>
               <w:top w:val="single" w:sz="2" w:space="0" w:color="CCCCCC"/>
               <w:start w:val="single" w:sz="2" w:space="0" w:color="CCCCCC"/>
@@ -764,7 +764,7 @@
         <w:trPr/>
         <w:tc>
           <w:tcPr>
-            <w:tcW w:w="3498" w:type="dxa"/>
+            <w:tcW w:w="3497" w:type="dxa"/>
             <w:tcBorders>
               <w:top w:val="single" w:sz="2" w:space="0" w:color="CCCCCC"/>
               <w:start w:val="single" w:sz="2" w:space="0" w:color="CCCCCC"/>
@@ -793,7 +793,7 @@
         </w:tc>
         <w:tc>
           <w:tcPr>
-            <w:tcW w:w="5862" w:type="dxa"/>
+            <w:tcW w:w="5863" w:type="dxa"/>
             <w:tcBorders>
               <w:top w:val="single" w:sz="2" w:space="0" w:color="CCCCCC"/>
               <w:start w:val="single" w:sz="2" w:space="0" w:color="CCCCCC"/>
@@ -825,7 +825,7 @@
         <w:trPr/>
         <w:tc>
           <w:tcPr>
-            <w:tcW w:w="3498" w:type="dxa"/>
+            <w:tcW w:w="3497" w:type="dxa"/>
             <w:tcBorders>
               <w:top w:val="single" w:sz="2" w:space="0" w:color="CCCCCC"/>
               <w:start w:val="single" w:sz="2" w:space="0" w:color="CCCCCC"/>
@@ -854,7 +854,7 @@
         </w:tc>
         <w:tc>
           <w:tcPr>
-            <w:tcW w:w="5862" w:type="dxa"/>
+            <w:tcW w:w="5863" w:type="dxa"/>
             <w:tcBorders>
               <w:top w:val="single" w:sz="2" w:space="0" w:color="CCCCCC"/>
               <w:start w:val="single" w:sz="2" w:space="0" w:color="CCCCCC"/>
@@ -886,7 +886,7 @@
         <w:trPr/>
         <w:tc>
           <w:tcPr>
-            <w:tcW w:w="3498" w:type="dxa"/>
+            <w:tcW w:w="3497" w:type="dxa"/>
             <w:tcBorders>
               <w:top w:val="single" w:sz="2" w:space="0" w:color="CCCCCC"/>
               <w:start w:val="single" w:sz="2" w:space="0" w:color="CCCCCC"/>
@@ -915,7 +915,7 @@
         </w:tc>
         <w:tc>
           <w:tcPr>
-            <w:tcW w:w="5862" w:type="dxa"/>
+            <w:tcW w:w="5863" w:type="dxa"/>
             <w:tcBorders>
               <w:top w:val="single" w:sz="2" w:space="0" w:color="CCCCCC"/>
               <w:start w:val="single" w:sz="2" w:space="0" w:color="CCCCCC"/>
@@ -947,7 +947,7 @@
         <w:trPr/>
         <w:tc>
           <w:tcPr>
-            <w:tcW w:w="3498" w:type="dxa"/>
+            <w:tcW w:w="3497" w:type="dxa"/>
             <w:tcBorders>
               <w:top w:val="single" w:sz="2" w:space="0" w:color="CCCCCC"/>
               <w:start w:val="single" w:sz="2" w:space="0" w:color="CCCCCC"/>
@@ -976,7 +976,7 @@
         </w:tc>
         <w:tc>
           <w:tcPr>
-            <w:tcW w:w="5862" w:type="dxa"/>
+            <w:tcW w:w="5863" w:type="dxa"/>
             <w:tcBorders>
               <w:top w:val="single" w:sz="2" w:space="0" w:color="CCCCCC"/>
               <w:start w:val="single" w:sz="2" w:space="0" w:color="CCCCCC"/>
@@ -1008,7 +1008,7 @@
         <w:trPr/>
         <w:tc>
           <w:tcPr>
-            <w:tcW w:w="3498" w:type="dxa"/>
+            <w:tcW w:w="3497" w:type="dxa"/>
             <w:tcBorders>
               <w:top w:val="single" w:sz="2" w:space="0" w:color="CCCCCC"/>
               <w:start w:val="single" w:sz="2" w:space="0" w:color="CCCCCC"/>
@@ -1037,7 +1037,7 @@
         </w:tc>
         <w:tc>
           <w:tcPr>
-            <w:tcW w:w="5862" w:type="dxa"/>
+            <w:tcW w:w="5863" w:type="dxa"/>
             <w:tcBorders>
               <w:top w:val="single" w:sz="2" w:space="0" w:color="CCCCCC"/>
               <w:start w:val="single" w:sz="2" w:space="0" w:color="CCCCCC"/>
@@ -1069,7 +1069,7 @@
         <w:trPr/>
         <w:tc>
           <w:tcPr>
-            <w:tcW w:w="3498" w:type="dxa"/>
+            <w:tcW w:w="3497" w:type="dxa"/>
             <w:tcBorders>
               <w:top w:val="single" w:sz="2" w:space="0" w:color="CCCCCC"/>
               <w:start w:val="single" w:sz="2" w:space="0" w:color="CCCCCC"/>
@@ -1098,7 +1098,7 @@
         </w:tc>
         <w:tc>
           <w:tcPr>
-            <w:tcW w:w="5862" w:type="dxa"/>
+            <w:tcW w:w="5863" w:type="dxa"/>
             <w:tcBorders>
               <w:top w:val="single" w:sz="2" w:space="0" w:color="CCCCCC"/>
               <w:start w:val="single" w:sz="2" w:space="0" w:color="CCCCCC"/>
@@ -1988,14 +1988,14 @@
         </w:tblCellMar>
       </w:tblPr>
       <w:tblGrid>
-        <w:gridCol w:w="2798"/>
-        <w:gridCol w:w="6562"/>
+        <w:gridCol w:w="2797"/>
+        <w:gridCol w:w="6563"/>
       </w:tblGrid>
       <w:tr>
         <w:trPr/>
         <w:tc>
           <w:tcPr>
-            <w:tcW w:w="2798" w:type="dxa"/>
+            <w:tcW w:w="2797" w:type="dxa"/>
             <w:tcBorders>
               <w:top w:val="single" w:sz="2" w:space="0" w:color="CCCCCC"/>
               <w:start w:val="single" w:sz="2" w:space="0" w:color="CCCCCC"/>
@@ -2024,7 +2024,7 @@
         </w:tc>
         <w:tc>
           <w:tcPr>
-            <w:tcW w:w="6562" w:type="dxa"/>
+            <w:tcW w:w="6563" w:type="dxa"/>
             <w:tcBorders>
               <w:top w:val="single" w:sz="2" w:space="0" w:color="CCCCCC"/>
               <w:start w:val="single" w:sz="2" w:space="0" w:color="CCCCCC"/>
@@ -2056,7 +2056,7 @@
         <w:trPr/>
         <w:tc>
           <w:tcPr>
-            <w:tcW w:w="2798" w:type="dxa"/>
+            <w:tcW w:w="2797" w:type="dxa"/>
             <w:tcBorders>
               <w:top w:val="single" w:sz="2" w:space="0" w:color="CCCCCC"/>
               <w:start w:val="single" w:sz="2" w:space="0" w:color="CCCCCC"/>
@@ -2085,7 +2085,7 @@
         </w:tc>
         <w:tc>
           <w:tcPr>
-            <w:tcW w:w="6562" w:type="dxa"/>
+            <w:tcW w:w="6563" w:type="dxa"/>
             <w:tcBorders>
               <w:top w:val="single" w:sz="2" w:space="0" w:color="CCCCCC"/>
               <w:start w:val="single" w:sz="2" w:space="0" w:color="CCCCCC"/>
@@ -2117,7 +2117,7 @@
         <w:trPr/>
         <w:tc>
           <w:tcPr>
-            <w:tcW w:w="2798" w:type="dxa"/>
+            <w:tcW w:w="2797" w:type="dxa"/>
             <w:tcBorders>
               <w:top w:val="single" w:sz="2" w:space="0" w:color="CCCCCC"/>
               <w:start w:val="single" w:sz="2" w:space="0" w:color="CCCCCC"/>
@@ -2146,7 +2146,7 @@
         </w:tc>
         <w:tc>
           <w:tcPr>
-            <w:tcW w:w="6562" w:type="dxa"/>
+            <w:tcW w:w="6563" w:type="dxa"/>
             <w:tcBorders>
               <w:top w:val="single" w:sz="2" w:space="0" w:color="CCCCCC"/>
               <w:start w:val="single" w:sz="2" w:space="0" w:color="CCCCCC"/>
@@ -2178,7 +2178,7 @@
         <w:trPr/>
         <w:tc>
           <w:tcPr>
-            <w:tcW w:w="2798" w:type="dxa"/>
+            <w:tcW w:w="2797" w:type="dxa"/>
             <w:tcBorders>
               <w:top w:val="single" w:sz="2" w:space="0" w:color="CCCCCC"/>
               <w:start w:val="single" w:sz="2" w:space="0" w:color="CCCCCC"/>
@@ -2207,7 +2207,7 @@
         </w:tc>
         <w:tc>
           <w:tcPr>
-            <w:tcW w:w="6562" w:type="dxa"/>
+            <w:tcW w:w="6563" w:type="dxa"/>
             <w:tcBorders>
               <w:top w:val="single" w:sz="2" w:space="0" w:color="CCCCCC"/>
               <w:start w:val="single" w:sz="2" w:space="0" w:color="CCCCCC"/>
@@ -2239,7 +2239,7 @@
         <w:trPr/>
         <w:tc>
           <w:tcPr>
-            <w:tcW w:w="2798" w:type="dxa"/>
+            <w:tcW w:w="2797" w:type="dxa"/>
             <w:tcBorders>
               <w:top w:val="single" w:sz="2" w:space="0" w:color="CCCCCC"/>
               <w:start w:val="single" w:sz="2" w:space="0" w:color="CCCCCC"/>
@@ -2268,7 +2268,7 @@
         </w:tc>
         <w:tc>
           <w:tcPr>
-            <w:tcW w:w="6562" w:type="dxa"/>
+            <w:tcW w:w="6563" w:type="dxa"/>
             <w:tcBorders>
               <w:top w:val="single" w:sz="2" w:space="0" w:color="CCCCCC"/>
               <w:start w:val="single" w:sz="2" w:space="0" w:color="CCCCCC"/>
@@ -2300,7 +2300,7 @@
         <w:trPr/>
         <w:tc>
           <w:tcPr>
-            <w:tcW w:w="2798" w:type="dxa"/>
+            <w:tcW w:w="2797" w:type="dxa"/>
             <w:tcBorders>
               <w:top w:val="single" w:sz="2" w:space="0" w:color="CCCCCC"/>
               <w:start w:val="single" w:sz="2" w:space="0" w:color="CCCCCC"/>
@@ -2329,7 +2329,7 @@
         </w:tc>
         <w:tc>
           <w:tcPr>
-            <w:tcW w:w="6562" w:type="dxa"/>
+            <w:tcW w:w="6563" w:type="dxa"/>
             <w:tcBorders>
               <w:top w:val="single" w:sz="2" w:space="0" w:color="CCCCCC"/>
               <w:start w:val="single" w:sz="2" w:space="0" w:color="CCCCCC"/>
@@ -2530,7 +2530,7 @@
           <w:sz w:val="21"/>
           <w:szCs w:val="21"/>
         </w:rPr>
-        <w:t>Nach der Contract-LP-Erstellung kann jeder (einschließlich des Gründers) zusätzliche Liquidität zum selben Uniswap V3 Pool als separate Position hinzufügen. Das ist vollständig transparent auf Etherscan. Der Gründer plant, persönliches ETH als zusätzliche Liquidität hinzuzufügen, sichtbar als separate LP-Position.</w:t>
+        <w:t xml:space="preserve">Nach der Contract-LP-Erstellung kann jeder (einschließlich des Gründers) zusätzliche Liquidität zum selben Uniswap V3 Pool als separate Position hinzufügen. Das ist vollständig transparent auf Etherscan. </w:t>
       </w:r>
     </w:p>
     <w:p>
@@ -2604,8 +2604,8 @@
       </w:tblPr>
       <w:tblGrid>
         <w:gridCol w:w="2000"/>
-        <w:gridCol w:w="1498"/>
-        <w:gridCol w:w="1502"/>
+        <w:gridCol w:w="1497"/>
+        <w:gridCol w:w="1503"/>
         <w:gridCol w:w="1800"/>
         <w:gridCol w:w="2560"/>
       </w:tblGrid>
@@ -2642,7 +2642,7 @@
         </w:tc>
         <w:tc>
           <w:tcPr>
-            <w:tcW w:w="1498" w:type="dxa"/>
+            <w:tcW w:w="1497" w:type="dxa"/>
             <w:tcBorders>
               <w:top w:val="single" w:sz="2" w:space="0" w:color="CCCCCC"/>
               <w:start w:val="single" w:sz="2" w:space="0" w:color="CCCCCC"/>
@@ -2671,7 +2671,7 @@
         </w:tc>
         <w:tc>
           <w:tcPr>
-            <w:tcW w:w="1502" w:type="dxa"/>
+            <w:tcW w:w="1503" w:type="dxa"/>
             <w:tcBorders>
               <w:top w:val="single" w:sz="2" w:space="0" w:color="CCCCCC"/>
               <w:start w:val="single" w:sz="2" w:space="0" w:color="CCCCCC"/>
@@ -2790,7 +2790,7 @@
         </w:tc>
         <w:tc>
           <w:tcPr>
-            <w:tcW w:w="1498" w:type="dxa"/>
+            <w:tcW w:w="1497" w:type="dxa"/>
             <w:tcBorders>
               <w:top w:val="single" w:sz="2" w:space="0" w:color="CCCCCC"/>
               <w:start w:val="single" w:sz="2" w:space="0" w:color="CCCCCC"/>
@@ -2819,7 +2819,7 @@
         </w:tc>
         <w:tc>
           <w:tcPr>
-            <w:tcW w:w="1502" w:type="dxa"/>
+            <w:tcW w:w="1503" w:type="dxa"/>
             <w:tcBorders>
               <w:top w:val="single" w:sz="2" w:space="0" w:color="CCCCCC"/>
               <w:start w:val="single" w:sz="2" w:space="0" w:color="CCCCCC"/>
@@ -2938,7 +2938,7 @@
         </w:tc>
         <w:tc>
           <w:tcPr>
-            <w:tcW w:w="1498" w:type="dxa"/>
+            <w:tcW w:w="1497" w:type="dxa"/>
             <w:tcBorders>
               <w:top w:val="single" w:sz="2" w:space="0" w:color="CCCCCC"/>
               <w:start w:val="single" w:sz="2" w:space="0" w:color="CCCCCC"/>
@@ -2967,7 +2967,7 @@
         </w:tc>
         <w:tc>
           <w:tcPr>
-            <w:tcW w:w="1502" w:type="dxa"/>
+            <w:tcW w:w="1503" w:type="dxa"/>
             <w:tcBorders>
               <w:top w:val="single" w:sz="2" w:space="0" w:color="CCCCCC"/>
               <w:start w:val="single" w:sz="2" w:space="0" w:color="CCCCCC"/>
@@ -3086,7 +3086,7 @@
         </w:tc>
         <w:tc>
           <w:tcPr>
-            <w:tcW w:w="1498" w:type="dxa"/>
+            <w:tcW w:w="1497" w:type="dxa"/>
             <w:tcBorders>
               <w:top w:val="single" w:sz="2" w:space="0" w:color="CCCCCC"/>
               <w:start w:val="single" w:sz="2" w:space="0" w:color="CCCCCC"/>
@@ -3115,7 +3115,7 @@
         </w:tc>
         <w:tc>
           <w:tcPr>
-            <w:tcW w:w="1502" w:type="dxa"/>
+            <w:tcW w:w="1503" w:type="dxa"/>
             <w:tcBorders>
               <w:top w:val="single" w:sz="2" w:space="0" w:color="CCCCCC"/>
               <w:start w:val="single" w:sz="2" w:space="0" w:color="CCCCCC"/>
@@ -3234,7 +3234,7 @@
         </w:tc>
         <w:tc>
           <w:tcPr>
-            <w:tcW w:w="1498" w:type="dxa"/>
+            <w:tcW w:w="1497" w:type="dxa"/>
             <w:tcBorders>
               <w:top w:val="single" w:sz="2" w:space="0" w:color="CCCCCC"/>
               <w:start w:val="single" w:sz="2" w:space="0" w:color="CCCCCC"/>
@@ -3263,7 +3263,7 @@
         </w:tc>
         <w:tc>
           <w:tcPr>
-            <w:tcW w:w="1502" w:type="dxa"/>
+            <w:tcW w:w="1503" w:type="dxa"/>
             <w:tcBorders>
               <w:top w:val="single" w:sz="2" w:space="0" w:color="CCCCCC"/>
               <w:start w:val="single" w:sz="2" w:space="0" w:color="CCCCCC"/>
@@ -3799,8 +3799,8 @@
       <w:tblGrid>
         <w:gridCol w:w="2500"/>
         <w:gridCol w:w="2000"/>
-        <w:gridCol w:w="1998"/>
-        <w:gridCol w:w="2862"/>
+        <w:gridCol w:w="1997"/>
+        <w:gridCol w:w="2863"/>
       </w:tblGrid>
       <w:tr>
         <w:trPr/>
@@ -3864,7 +3864,7 @@
         </w:tc>
         <w:tc>
           <w:tcPr>
-            <w:tcW w:w="1998" w:type="dxa"/>
+            <w:tcW w:w="1997" w:type="dxa"/>
             <w:tcBorders>
               <w:top w:val="single" w:sz="2" w:space="0" w:color="CCCCCC"/>
               <w:start w:val="single" w:sz="2" w:space="0" w:color="CCCCCC"/>
@@ -3893,7 +3893,7 @@
         </w:tc>
         <w:tc>
           <w:tcPr>
-            <w:tcW w:w="2862" w:type="dxa"/>
+            <w:tcW w:w="2863" w:type="dxa"/>
             <w:tcBorders>
               <w:top w:val="single" w:sz="2" w:space="0" w:color="CCCCCC"/>
               <w:start w:val="single" w:sz="2" w:space="0" w:color="CCCCCC"/>
@@ -3983,7 +3983,7 @@
         </w:tc>
         <w:tc>
           <w:tcPr>
-            <w:tcW w:w="1998" w:type="dxa"/>
+            <w:tcW w:w="1997" w:type="dxa"/>
             <w:tcBorders>
               <w:top w:val="single" w:sz="2" w:space="0" w:color="CCCCCC"/>
               <w:start w:val="single" w:sz="2" w:space="0" w:color="CCCCCC"/>
@@ -4012,7 +4012,7 @@
         </w:tc>
         <w:tc>
           <w:tcPr>
-            <w:tcW w:w="2862" w:type="dxa"/>
+            <w:tcW w:w="2863" w:type="dxa"/>
             <w:tcBorders>
               <w:top w:val="single" w:sz="2" w:space="0" w:color="CCCCCC"/>
               <w:start w:val="single" w:sz="2" w:space="0" w:color="CCCCCC"/>
@@ -4102,7 +4102,7 @@
         </w:tc>
         <w:tc>
           <w:tcPr>
-            <w:tcW w:w="1998" w:type="dxa"/>
+            <w:tcW w:w="1997" w:type="dxa"/>
             <w:tcBorders>
               <w:top w:val="single" w:sz="2" w:space="0" w:color="CCCCCC"/>
               <w:start w:val="single" w:sz="2" w:space="0" w:color="CCCCCC"/>
@@ -4131,7 +4131,7 @@
         </w:tc>
         <w:tc>
           <w:tcPr>
-            <w:tcW w:w="2862" w:type="dxa"/>
+            <w:tcW w:w="2863" w:type="dxa"/>
             <w:tcBorders>
               <w:top w:val="single" w:sz="2" w:space="0" w:color="CCCCCC"/>
               <w:start w:val="single" w:sz="2" w:space="0" w:color="CCCCCC"/>
@@ -4221,7 +4221,7 @@
         </w:tc>
         <w:tc>
           <w:tcPr>
-            <w:tcW w:w="1998" w:type="dxa"/>
+            <w:tcW w:w="1997" w:type="dxa"/>
             <w:tcBorders>
               <w:top w:val="single" w:sz="2" w:space="0" w:color="CCCCCC"/>
               <w:start w:val="single" w:sz="2" w:space="0" w:color="CCCCCC"/>
@@ -4250,7 +4250,7 @@
         </w:tc>
         <w:tc>
           <w:tcPr>
-            <w:tcW w:w="2862" w:type="dxa"/>
+            <w:tcW w:w="2863" w:type="dxa"/>
             <w:tcBorders>
               <w:top w:val="single" w:sz="2" w:space="0" w:color="CCCCCC"/>
               <w:start w:val="single" w:sz="2" w:space="0" w:color="CCCCCC"/>
@@ -4340,7 +4340,7 @@
         </w:tc>
         <w:tc>
           <w:tcPr>
-            <w:tcW w:w="1998" w:type="dxa"/>
+            <w:tcW w:w="1997" w:type="dxa"/>
             <w:tcBorders>
               <w:top w:val="single" w:sz="2" w:space="0" w:color="CCCCCC"/>
               <w:start w:val="single" w:sz="2" w:space="0" w:color="CCCCCC"/>
@@ -4369,7 +4369,7 @@
         </w:tc>
         <w:tc>
           <w:tcPr>
-            <w:tcW w:w="2862" w:type="dxa"/>
+            <w:tcW w:w="2863" w:type="dxa"/>
             <w:tcBorders>
               <w:top w:val="single" w:sz="2" w:space="0" w:color="CCCCCC"/>
               <w:start w:val="single" w:sz="2" w:space="0" w:color="CCCCCC"/>
@@ -4459,7 +4459,7 @@
         </w:tc>
         <w:tc>
           <w:tcPr>
-            <w:tcW w:w="1998" w:type="dxa"/>
+            <w:tcW w:w="1997" w:type="dxa"/>
             <w:tcBorders>
               <w:top w:val="single" w:sz="2" w:space="0" w:color="CCCCCC"/>
               <w:start w:val="single" w:sz="2" w:space="0" w:color="CCCCCC"/>
@@ -4488,7 +4488,7 @@
         </w:tc>
         <w:tc>
           <w:tcPr>
-            <w:tcW w:w="2862" w:type="dxa"/>
+            <w:tcW w:w="2863" w:type="dxa"/>
             <w:tcBorders>
               <w:top w:val="single" w:sz="2" w:space="0" w:color="CCCCCC"/>
               <w:start w:val="single" w:sz="2" w:space="0" w:color="CCCCCC"/>
@@ -4701,8 +4701,8 @@
       <w:tblGrid>
         <w:gridCol w:w="1500"/>
         <w:gridCol w:w="2200"/>
-        <w:gridCol w:w="2198"/>
-        <w:gridCol w:w="3462"/>
+        <w:gridCol w:w="2197"/>
+        <w:gridCol w:w="3463"/>
       </w:tblGrid>
       <w:tr>
         <w:trPr/>
@@ -4766,7 +4766,7 @@
         </w:tc>
         <w:tc>
           <w:tcPr>
-            <w:tcW w:w="2198" w:type="dxa"/>
+            <w:tcW w:w="2197" w:type="dxa"/>
             <w:tcBorders>
               <w:top w:val="single" w:sz="2" w:space="0" w:color="CCCCCC"/>
               <w:start w:val="single" w:sz="2" w:space="0" w:color="CCCCCC"/>
@@ -4795,7 +4795,7 @@
         </w:tc>
         <w:tc>
           <w:tcPr>
-            <w:tcW w:w="3462" w:type="dxa"/>
+            <w:tcW w:w="3463" w:type="dxa"/>
             <w:tcBorders>
               <w:top w:val="single" w:sz="2" w:space="0" w:color="CCCCCC"/>
               <w:start w:val="single" w:sz="2" w:space="0" w:color="CCCCCC"/>
@@ -4885,7 +4885,7 @@
         </w:tc>
         <w:tc>
           <w:tcPr>
-            <w:tcW w:w="2198" w:type="dxa"/>
+            <w:tcW w:w="2197" w:type="dxa"/>
             <w:tcBorders>
               <w:top w:val="single" w:sz="2" w:space="0" w:color="CCCCCC"/>
               <w:start w:val="single" w:sz="2" w:space="0" w:color="CCCCCC"/>
@@ -4914,7 +4914,7 @@
         </w:tc>
         <w:tc>
           <w:tcPr>
-            <w:tcW w:w="3462" w:type="dxa"/>
+            <w:tcW w:w="3463" w:type="dxa"/>
             <w:tcBorders>
               <w:top w:val="single" w:sz="2" w:space="0" w:color="CCCCCC"/>
               <w:start w:val="single" w:sz="2" w:space="0" w:color="CCCCCC"/>
@@ -5004,7 +5004,7 @@
         </w:tc>
         <w:tc>
           <w:tcPr>
-            <w:tcW w:w="2198" w:type="dxa"/>
+            <w:tcW w:w="2197" w:type="dxa"/>
             <w:tcBorders>
               <w:top w:val="single" w:sz="2" w:space="0" w:color="CCCCCC"/>
               <w:start w:val="single" w:sz="2" w:space="0" w:color="CCCCCC"/>
@@ -5033,7 +5033,7 @@
         </w:tc>
         <w:tc>
           <w:tcPr>
-            <w:tcW w:w="3462" w:type="dxa"/>
+            <w:tcW w:w="3463" w:type="dxa"/>
             <w:tcBorders>
               <w:top w:val="single" w:sz="2" w:space="0" w:color="CCCCCC"/>
               <w:start w:val="single" w:sz="2" w:space="0" w:color="CCCCCC"/>
@@ -5123,7 +5123,7 @@
         </w:tc>
         <w:tc>
           <w:tcPr>
-            <w:tcW w:w="2198" w:type="dxa"/>
+            <w:tcW w:w="2197" w:type="dxa"/>
             <w:tcBorders>
               <w:top w:val="single" w:sz="2" w:space="0" w:color="CCCCCC"/>
               <w:start w:val="single" w:sz="2" w:space="0" w:color="CCCCCC"/>
@@ -5152,7 +5152,7 @@
         </w:tc>
         <w:tc>
           <w:tcPr>
-            <w:tcW w:w="3462" w:type="dxa"/>
+            <w:tcW w:w="3463" w:type="dxa"/>
             <w:tcBorders>
               <w:top w:val="single" w:sz="2" w:space="0" w:color="CCCCCC"/>
               <w:start w:val="single" w:sz="2" w:space="0" w:color="CCCCCC"/>
@@ -5242,7 +5242,7 @@
         </w:tc>
         <w:tc>
           <w:tcPr>
-            <w:tcW w:w="2198" w:type="dxa"/>
+            <w:tcW w:w="2197" w:type="dxa"/>
             <w:tcBorders>
               <w:top w:val="single" w:sz="2" w:space="0" w:color="CCCCCC"/>
               <w:start w:val="single" w:sz="2" w:space="0" w:color="CCCCCC"/>
@@ -5271,7 +5271,7 @@
         </w:tc>
         <w:tc>
           <w:tcPr>
-            <w:tcW w:w="3462" w:type="dxa"/>
+            <w:tcW w:w="3463" w:type="dxa"/>
             <w:tcBorders>
               <w:top w:val="single" w:sz="2" w:space="0" w:color="CCCCCC"/>
               <w:start w:val="single" w:sz="2" w:space="0" w:color="CCCCCC"/>
@@ -5361,7 +5361,7 @@
         </w:tc>
         <w:tc>
           <w:tcPr>
-            <w:tcW w:w="2198" w:type="dxa"/>
+            <w:tcW w:w="2197" w:type="dxa"/>
             <w:tcBorders>
               <w:top w:val="single" w:sz="2" w:space="0" w:color="CCCCCC"/>
               <w:start w:val="single" w:sz="2" w:space="0" w:color="CCCCCC"/>
@@ -5390,7 +5390,7 @@
         </w:tc>
         <w:tc>
           <w:tcPr>
-            <w:tcW w:w="3462" w:type="dxa"/>
+            <w:tcW w:w="3463" w:type="dxa"/>
             <w:tcBorders>
               <w:top w:val="single" w:sz="2" w:space="0" w:color="CCCCCC"/>
               <w:start w:val="single" w:sz="2" w:space="0" w:color="CCCCCC"/>
@@ -5479,14 +5479,14 @@
         </w:tblCellMar>
       </w:tblPr>
       <w:tblGrid>
-        <w:gridCol w:w="3498"/>
-        <w:gridCol w:w="5862"/>
+        <w:gridCol w:w="3497"/>
+        <w:gridCol w:w="5863"/>
       </w:tblGrid>
       <w:tr>
         <w:trPr/>
         <w:tc>
           <w:tcPr>
-            <w:tcW w:w="3498" w:type="dxa"/>
+            <w:tcW w:w="3497" w:type="dxa"/>
             <w:tcBorders>
               <w:top w:val="single" w:sz="2" w:space="0" w:color="CCCCCC"/>
               <w:start w:val="single" w:sz="2" w:space="0" w:color="CCCCCC"/>
@@ -5515,7 +5515,7 @@
         </w:tc>
         <w:tc>
           <w:tcPr>
-            <w:tcW w:w="5862" w:type="dxa"/>
+            <w:tcW w:w="5863" w:type="dxa"/>
             <w:tcBorders>
               <w:top w:val="single" w:sz="2" w:space="0" w:color="CCCCCC"/>
               <w:start w:val="single" w:sz="2" w:space="0" w:color="CCCCCC"/>
@@ -5547,7 +5547,7 @@
         <w:trPr/>
         <w:tc>
           <w:tcPr>
-            <w:tcW w:w="3498" w:type="dxa"/>
+            <w:tcW w:w="3497" w:type="dxa"/>
             <w:tcBorders>
               <w:top w:val="single" w:sz="2" w:space="0" w:color="CCCCCC"/>
               <w:start w:val="single" w:sz="2" w:space="0" w:color="CCCCCC"/>
@@ -5576,7 +5576,7 @@
         </w:tc>
         <w:tc>
           <w:tcPr>
-            <w:tcW w:w="5862" w:type="dxa"/>
+            <w:tcW w:w="5863" w:type="dxa"/>
             <w:tcBorders>
               <w:top w:val="single" w:sz="2" w:space="0" w:color="CCCCCC"/>
               <w:start w:val="single" w:sz="2" w:space="0" w:color="CCCCCC"/>
@@ -5608,7 +5608,7 @@
         <w:trPr/>
         <w:tc>
           <w:tcPr>
-            <w:tcW w:w="3498" w:type="dxa"/>
+            <w:tcW w:w="3497" w:type="dxa"/>
             <w:tcBorders>
               <w:top w:val="single" w:sz="2" w:space="0" w:color="CCCCCC"/>
               <w:start w:val="single" w:sz="2" w:space="0" w:color="CCCCCC"/>
@@ -5637,7 +5637,7 @@
         </w:tc>
         <w:tc>
           <w:tcPr>
-            <w:tcW w:w="5862" w:type="dxa"/>
+            <w:tcW w:w="5863" w:type="dxa"/>
             <w:tcBorders>
               <w:top w:val="single" w:sz="2" w:space="0" w:color="CCCCCC"/>
               <w:start w:val="single" w:sz="2" w:space="0" w:color="CCCCCC"/>
@@ -5669,7 +5669,7 @@
         <w:trPr/>
         <w:tc>
           <w:tcPr>
-            <w:tcW w:w="3498" w:type="dxa"/>
+            <w:tcW w:w="3497" w:type="dxa"/>
             <w:tcBorders>
               <w:top w:val="single" w:sz="2" w:space="0" w:color="CCCCCC"/>
               <w:start w:val="single" w:sz="2" w:space="0" w:color="CCCCCC"/>
@@ -5698,7 +5698,7 @@
         </w:tc>
         <w:tc>
           <w:tcPr>
-            <w:tcW w:w="5862" w:type="dxa"/>
+            <w:tcW w:w="5863" w:type="dxa"/>
             <w:tcBorders>
               <w:top w:val="single" w:sz="2" w:space="0" w:color="CCCCCC"/>
               <w:start w:val="single" w:sz="2" w:space="0" w:color="CCCCCC"/>
@@ -5730,7 +5730,7 @@
         <w:trPr/>
         <w:tc>
           <w:tcPr>
-            <w:tcW w:w="3498" w:type="dxa"/>
+            <w:tcW w:w="3497" w:type="dxa"/>
             <w:tcBorders>
               <w:top w:val="single" w:sz="2" w:space="0" w:color="CCCCCC"/>
               <w:start w:val="single" w:sz="2" w:space="0" w:color="CCCCCC"/>
@@ -5759,7 +5759,7 @@
         </w:tc>
         <w:tc>
           <w:tcPr>
-            <w:tcW w:w="5862" w:type="dxa"/>
+            <w:tcW w:w="5863" w:type="dxa"/>
             <w:tcBorders>
               <w:top w:val="single" w:sz="2" w:space="0" w:color="CCCCCC"/>
               <w:start w:val="single" w:sz="2" w:space="0" w:color="CCCCCC"/>
@@ -5791,7 +5791,7 @@
         <w:trPr/>
         <w:tc>
           <w:tcPr>
-            <w:tcW w:w="3498" w:type="dxa"/>
+            <w:tcW w:w="3497" w:type="dxa"/>
             <w:tcBorders>
               <w:top w:val="single" w:sz="2" w:space="0" w:color="CCCCCC"/>
               <w:start w:val="single" w:sz="2" w:space="0" w:color="CCCCCC"/>
@@ -5820,7 +5820,7 @@
         </w:tc>
         <w:tc>
           <w:tcPr>
-            <w:tcW w:w="5862" w:type="dxa"/>
+            <w:tcW w:w="5863" w:type="dxa"/>
             <w:tcBorders>
               <w:top w:val="single" w:sz="2" w:space="0" w:color="CCCCCC"/>
               <w:start w:val="single" w:sz="2" w:space="0" w:color="CCCCCC"/>
@@ -5852,7 +5852,7 @@
         <w:trPr/>
         <w:tc>
           <w:tcPr>
-            <w:tcW w:w="3498" w:type="dxa"/>
+            <w:tcW w:w="3497" w:type="dxa"/>
             <w:tcBorders>
               <w:top w:val="single" w:sz="2" w:space="0" w:color="CCCCCC"/>
               <w:start w:val="single" w:sz="2" w:space="0" w:color="CCCCCC"/>
@@ -5881,7 +5881,7 @@
         </w:tc>
         <w:tc>
           <w:tcPr>
-            <w:tcW w:w="5862" w:type="dxa"/>
+            <w:tcW w:w="5863" w:type="dxa"/>
             <w:tcBorders>
               <w:top w:val="single" w:sz="2" w:space="0" w:color="CCCCCC"/>
               <w:start w:val="single" w:sz="2" w:space="0" w:color="CCCCCC"/>
@@ -5913,7 +5913,7 @@
         <w:trPr/>
         <w:tc>
           <w:tcPr>
-            <w:tcW w:w="3498" w:type="dxa"/>
+            <w:tcW w:w="3497" w:type="dxa"/>
             <w:tcBorders>
               <w:top w:val="single" w:sz="2" w:space="0" w:color="CCCCCC"/>
               <w:start w:val="single" w:sz="2" w:space="0" w:color="CCCCCC"/>
@@ -5942,7 +5942,7 @@
         </w:tc>
         <w:tc>
           <w:tcPr>
-            <w:tcW w:w="5862" w:type="dxa"/>
+            <w:tcW w:w="5863" w:type="dxa"/>
             <w:tcBorders>
               <w:top w:val="single" w:sz="2" w:space="0" w:color="CCCCCC"/>
               <w:start w:val="single" w:sz="2" w:space="0" w:color="CCCCCC"/>
@@ -5974,7 +5974,7 @@
         <w:trPr/>
         <w:tc>
           <w:tcPr>
-            <w:tcW w:w="3498" w:type="dxa"/>
+            <w:tcW w:w="3497" w:type="dxa"/>
             <w:tcBorders>
               <w:top w:val="single" w:sz="2" w:space="0" w:color="CCCCCC"/>
               <w:start w:val="single" w:sz="2" w:space="0" w:color="CCCCCC"/>
@@ -6003,7 +6003,7 @@
         </w:tc>
         <w:tc>
           <w:tcPr>
-            <w:tcW w:w="5862" w:type="dxa"/>
+            <w:tcW w:w="5863" w:type="dxa"/>
             <w:tcBorders>
               <w:top w:val="single" w:sz="2" w:space="0" w:color="CCCCCC"/>
               <w:start w:val="single" w:sz="2" w:space="0" w:color="CCCCCC"/>
@@ -7819,9 +7819,9 @@
       </w:tblPr>
       <w:tblGrid>
         <w:gridCol w:w="2500"/>
-        <w:gridCol w:w="2298"/>
+        <w:gridCol w:w="2297"/>
         <w:gridCol w:w="2300"/>
-        <w:gridCol w:w="2262"/>
+        <w:gridCol w:w="2263"/>
       </w:tblGrid>
       <w:tr>
         <w:trPr/>
@@ -7856,7 +7856,7 @@
         </w:tc>
         <w:tc>
           <w:tcPr>
-            <w:tcW w:w="2298" w:type="dxa"/>
+            <w:tcW w:w="2297" w:type="dxa"/>
             <w:tcBorders>
               <w:top w:val="single" w:sz="2" w:space="0" w:color="CCCCCC"/>
               <w:start w:val="single" w:sz="2" w:space="0" w:color="CCCCCC"/>
@@ -7914,7 +7914,7 @@
         </w:tc>
         <w:tc>
           <w:tcPr>
-            <w:tcW w:w="2262" w:type="dxa"/>
+            <w:tcW w:w="2263" w:type="dxa"/>
             <w:tcBorders>
               <w:top w:val="single" w:sz="2" w:space="0" w:color="CCCCCC"/>
               <w:start w:val="single" w:sz="2" w:space="0" w:color="CCCCCC"/>
@@ -7975,7 +7975,7 @@
         </w:tc>
         <w:tc>
           <w:tcPr>
-            <w:tcW w:w="2298" w:type="dxa"/>
+            <w:tcW w:w="2297" w:type="dxa"/>
             <w:tcBorders>
               <w:top w:val="single" w:sz="2" w:space="0" w:color="CCCCCC"/>
               <w:start w:val="single" w:sz="2" w:space="0" w:color="CCCCCC"/>
@@ -8033,7 +8033,7 @@
         </w:tc>
         <w:tc>
           <w:tcPr>
-            <w:tcW w:w="2262" w:type="dxa"/>
+            <w:tcW w:w="2263" w:type="dxa"/>
             <w:tcBorders>
               <w:top w:val="single" w:sz="2" w:space="0" w:color="CCCCCC"/>
               <w:start w:val="single" w:sz="2" w:space="0" w:color="CCCCCC"/>
@@ -8094,7 +8094,7 @@
         </w:tc>
         <w:tc>
           <w:tcPr>
-            <w:tcW w:w="2298" w:type="dxa"/>
+            <w:tcW w:w="2297" w:type="dxa"/>
             <w:tcBorders>
               <w:top w:val="single" w:sz="2" w:space="0" w:color="CCCCCC"/>
               <w:start w:val="single" w:sz="2" w:space="0" w:color="CCCCCC"/>
@@ -8152,7 +8152,7 @@
         </w:tc>
         <w:tc>
           <w:tcPr>
-            <w:tcW w:w="2262" w:type="dxa"/>
+            <w:tcW w:w="2263" w:type="dxa"/>
             <w:tcBorders>
               <w:top w:val="single" w:sz="2" w:space="0" w:color="CCCCCC"/>
               <w:start w:val="single" w:sz="2" w:space="0" w:color="CCCCCC"/>
@@ -8213,7 +8213,7 @@
         </w:tc>
         <w:tc>
           <w:tcPr>
-            <w:tcW w:w="2298" w:type="dxa"/>
+            <w:tcW w:w="2297" w:type="dxa"/>
             <w:tcBorders>
               <w:top w:val="single" w:sz="2" w:space="0" w:color="CCCCCC"/>
               <w:start w:val="single" w:sz="2" w:space="0" w:color="CCCCCC"/>
@@ -8271,7 +8271,7 @@
         </w:tc>
         <w:tc>
           <w:tcPr>
-            <w:tcW w:w="2262" w:type="dxa"/>
+            <w:tcW w:w="2263" w:type="dxa"/>
             <w:tcBorders>
               <w:top w:val="single" w:sz="2" w:space="0" w:color="CCCCCC"/>
               <w:start w:val="single" w:sz="2" w:space="0" w:color="CCCCCC"/>
@@ -8332,7 +8332,7 @@
         </w:tc>
         <w:tc>
           <w:tcPr>
-            <w:tcW w:w="2298" w:type="dxa"/>
+            <w:tcW w:w="2297" w:type="dxa"/>
             <w:tcBorders>
               <w:top w:val="single" w:sz="2" w:space="0" w:color="CCCCCC"/>
               <w:start w:val="single" w:sz="2" w:space="0" w:color="CCCCCC"/>
@@ -8390,7 +8390,7 @@
         </w:tc>
         <w:tc>
           <w:tcPr>
-            <w:tcW w:w="2262" w:type="dxa"/>
+            <w:tcW w:w="2263" w:type="dxa"/>
             <w:tcBorders>
               <w:top w:val="single" w:sz="2" w:space="0" w:color="CCCCCC"/>
               <w:start w:val="single" w:sz="2" w:space="0" w:color="CCCCCC"/>
@@ -8451,7 +8451,7 @@
         </w:tc>
         <w:tc>
           <w:tcPr>
-            <w:tcW w:w="2298" w:type="dxa"/>
+            <w:tcW w:w="2297" w:type="dxa"/>
             <w:tcBorders>
               <w:top w:val="single" w:sz="2" w:space="0" w:color="CCCCCC"/>
               <w:start w:val="single" w:sz="2" w:space="0" w:color="CCCCCC"/>
@@ -8509,7 +8509,7 @@
         </w:tc>
         <w:tc>
           <w:tcPr>
-            <w:tcW w:w="2262" w:type="dxa"/>
+            <w:tcW w:w="2263" w:type="dxa"/>
             <w:tcBorders>
               <w:top w:val="single" w:sz="2" w:space="0" w:color="CCCCCC"/>
               <w:start w:val="single" w:sz="2" w:space="0" w:color="CCCCCC"/>
@@ -10285,7 +10285,7 @@
   </w:style>
   <w:style w:type="paragraph" w:styleId="Heading1">
     <w:name w:val="heading 1"/>
-    <w:basedOn w:val="berschriftuser"/>
+    <w:basedOn w:val="berschrift"/>
     <w:qFormat/>
     <w:pPr>
       <w:spacing w:before="360" w:after="200"/>
@@ -10302,7 +10302,7 @@
   </w:style>
   <w:style w:type="paragraph" w:styleId="Heading2">
     <w:name w:val="heading 2"/>
-    <w:basedOn w:val="berschriftuser"/>
+    <w:basedOn w:val="berschrift"/>
     <w:qFormat/>
     <w:pPr>
       <w:spacing w:before="240" w:after="160"/>
@@ -10319,7 +10319,7 @@
   </w:style>
   <w:style w:type="paragraph" w:styleId="Heading3">
     <w:name w:val="heading 3"/>
-    <w:basedOn w:val="berschriftuser"/>
+    <w:basedOn w:val="berschrift"/>
     <w:qFormat/>
     <w:pPr/>
     <w:rPr>
@@ -10330,7 +10330,7 @@
   </w:style>
   <w:style w:type="paragraph" w:styleId="Heading4">
     <w:name w:val="heading 4"/>
-    <w:basedOn w:val="berschriftuser"/>
+    <w:basedOn w:val="berschrift"/>
     <w:qFormat/>
     <w:pPr/>
     <w:rPr>
@@ -10341,7 +10341,7 @@
   </w:style>
   <w:style w:type="paragraph" w:styleId="Heading5">
     <w:name w:val="heading 5"/>
-    <w:basedOn w:val="berschriftuser"/>
+    <w:basedOn w:val="berschrift"/>
     <w:qFormat/>
     <w:pPr/>
     <w:rPr>
@@ -10350,7 +10350,7 @@
   </w:style>
   <w:style w:type="paragraph" w:styleId="Heading6">
     <w:name w:val="heading 6"/>
-    <w:basedOn w:val="berschriftuser"/>
+    <w:basedOn w:val="berschrift"/>
     <w:qFormat/>
     <w:pPr/>
     <w:rPr>
@@ -10366,8 +10366,8 @@
       <w:u w:val="single"/>
     </w:rPr>
   </w:style>
-  <w:style w:type="character" w:styleId="Funotenzeichenuser">
-    <w:name w:val="Fußnotenzeichen (user)"/>
+  <w:style w:type="character" w:styleId="Funotenzeichen">
+    <w:name w:val="Fußnotenzeichen"/>
     <w:uiPriority w:val="99"/>
     <w:semiHidden/>
     <w:unhideWhenUsed/>
@@ -10376,8 +10376,8 @@
       <w:vertAlign w:val="superscript"/>
     </w:rPr>
   </w:style>
-  <w:style w:type="character" w:styleId="Funotenzeichen">
-    <w:name w:val="Fußnotenzeichen"/>
+  <w:style w:type="character" w:styleId="Funotenzeichenuser">
+    <w:name w:val="Fußnotenzeichen (user)"/>
     <w:qFormat/>
     <w:rPr>
       <w:vertAlign w:val="superscript"/>
@@ -10486,7 +10486,7 @@
   </w:style>
   <w:style w:type="paragraph" w:styleId="Title">
     <w:name w:val="Title"/>
-    <w:basedOn w:val="berschriftuser"/>
+    <w:basedOn w:val="berschrift"/>
     <w:qFormat/>
     <w:pPr/>
     <w:rPr>
@@ -10549,6 +10549,13 @@
       <w:szCs w:val="20"/>
     </w:rPr>
   </w:style>
+  <w:style w:type="paragraph" w:styleId="Kopf-Fuzeile">
+    <w:name w:val="Kopf-/Fußzeile"/>
+    <w:basedOn w:val="Normal"/>
+    <w:qFormat/>
+    <w:pPr/>
+    <w:rPr/>
+  </w:style>
   <w:style w:type="paragraph" w:styleId="Kopf-Fuzeileuser">
     <w:name w:val="Kopf-/Fußzeile (user)"/>
     <w:basedOn w:val="Normal"/>
@@ -10556,22 +10563,15 @@
     <w:pPr/>
     <w:rPr/>
   </w:style>
-  <w:style w:type="paragraph" w:styleId="Kopf-Fuzeile">
-    <w:name w:val="Kopf-/Fußzeile"/>
-    <w:basedOn w:val="Normal"/>
-    <w:qFormat/>
-    <w:pPr/>
-    <w:rPr/>
-  </w:style>
   <w:style w:type="paragraph" w:styleId="Header">
     <w:name w:val="header"/>
-    <w:basedOn w:val="Kopf-Fuzeileuser"/>
+    <w:basedOn w:val="Kopf-Fuzeile"/>
     <w:pPr/>
     <w:rPr/>
   </w:style>
   <w:style w:type="paragraph" w:styleId="Footer">
     <w:name w:val="footer"/>
-    <w:basedOn w:val="Kopf-Fuzeileuser"/>
+    <w:basedOn w:val="Kopf-Fuzeile"/>
     <w:pPr/>
     <w:rPr/>
   </w:style>

</xml_diff>